<commit_message>
Remove menções de produto gratuito do app, do guia e do README
O CliniLoop passa a ser vendido. O modo "Claude gratuito" vira "Claude sem assinatura"; preços de ferramentas de terceiros e regras dos conselhos ficam como estão.

Co-Authored-By: Claude Opus 5.5 <noreply@anthropic.com>
Claude-Session: https://claude.ai/code/session_01FRoDe5TLvadjDWs3JedQJ9
</commit_message>
<xml_diff>
--- a/docs/SUPLEMENTO_EDICAO_2.docx
+++ b/docs/SUPLEMENTO_EDICAO_2.docx
@@ -1233,13 +1233,13 @@
       </w:tr>
     </w:tbl>
     <w:bookmarkEnd w:id="22"/>
-    <w:bookmarkStart w:id="23" w:name="X33dd1ef105c44a24b978aa382b0aa83b4a0c82b"/>
+    <w:bookmarkStart w:id="23" w:name="X9ff527c866e3792a4c381aa9ce3f6569b1833dd"/>
     <w:p>
       <w:pPr>
         <w:pStyle w:val="Heading3"/>
       </w:pPr>
       <w:r>
-        <w:t xml:space="preserve">Semana 3: Atendimento e colegas (partes 6, 8, 9 e 11 do livro)</w:t>
+        <w:t xml:space="preserve">Semana 3: Atendimento e colegas (partes 8, 10, 11 e 13 do livro)</w:t>
       </w:r>
     </w:p>
     <w:tbl>
@@ -1683,13 +1683,13 @@
       </w:tr>
     </w:tbl>
     <w:bookmarkEnd w:id="23"/>
-    <w:bookmarkStart w:id="24" w:name="X536d3cfd5b4a1d17a84119234ac7011209cc3a5"/>
+    <w:bookmarkStart w:id="24" w:name="Xde254450140cd94e4a9cde015f73773fb1c4812"/>
     <w:p>
       <w:pPr>
         <w:pStyle w:val="Heading3"/>
       </w:pPr>
       <w:r>
-        <w:t xml:space="preserve">Semana 4: Medir e ajustar (partes 11, 13 e 14 do livro)</w:t>
+        <w:t xml:space="preserve">Semana 4: Medir e ajustar (partes 13, 15 e 16 do livro)</w:t>
       </w:r>
     </w:p>
     <w:tbl>
@@ -1955,13 +1955,13 @@
               <w:t xml:space="preserve">“</w:t>
             </w:r>
             <w:r>
-              <w:t xml:space="preserve">Os sete sins</w:t>
+              <w:t xml:space="preserve">As sete decisões</w:t>
             </w:r>
             <w:r>
               <w:t xml:space="preserve">”</w:t>
             </w:r>
             <w:r>
-              <w:t xml:space="preserve">: onde o paciente está se perdendo?</w:t>
+              <w:t xml:space="preserve">: em qual delas o paciente está se perdendo?</w:t>
             </w:r>
           </w:p>
         </w:tc>
@@ -3154,13 +3154,13 @@
       </w:r>
     </w:p>
     <w:bookmarkEnd w:id="29"/>
-    <w:bookmarkStart w:id="30" w:name="carta-de-apresentação-a-colegas-parte-6"/>
+    <w:bookmarkStart w:id="30" w:name="carta-de-apresentação-a-colegas-parte-8"/>
     <w:p>
       <w:pPr>
         <w:pStyle w:val="Heading3"/>
       </w:pPr>
       <w:r>
-        <w:t xml:space="preserve">3.4 Carta de apresentação a colegas (Parte 6)</w:t>
+        <w:t xml:space="preserve">3.4 Carta de apresentação a colegas (Parte 8)</w:t>
       </w:r>
     </w:p>
     <w:p>
@@ -3241,13 +3241,13 @@
       </w:r>
     </w:p>
     <w:bookmarkEnd w:id="30"/>
-    <w:bookmarkStart w:id="31" w:name="relatório-de-contrarreferência-parte-6"/>
+    <w:bookmarkStart w:id="31" w:name="relatório-de-contrarreferência-parte-8"/>
     <w:p>
       <w:pPr>
         <w:pStyle w:val="Heading3"/>
       </w:pPr>
       <w:r>
-        <w:t xml:space="preserve">3.5 Relatório de contrarreferência (Parte 6)</w:t>
+        <w:t xml:space="preserve">3.5 Relatório de contrarreferência (Parte 8)</w:t>
       </w:r>
     </w:p>
     <w:p>
@@ -3406,13 +3406,13 @@
       </w:r>
     </w:p>
     <w:bookmarkEnd w:id="31"/>
-    <w:bookmarkStart w:id="32" w:name="anúncio-meta-e-google-parte-7"/>
+    <w:bookmarkStart w:id="32" w:name="anúncio-meta-e-google-parte-9"/>
     <w:p>
       <w:pPr>
         <w:pStyle w:val="Heading3"/>
       </w:pPr>
       <w:r>
-        <w:t xml:space="preserve">3.6 Anúncio Meta e Google (Parte 7)</w:t>
+        <w:t xml:space="preserve">3.6 Anúncio Meta e Google (Parte 9)</w:t>
       </w:r>
     </w:p>
     <w:p>
@@ -3607,13 +3607,13 @@
       </w:r>
     </w:p>
     <w:bookmarkEnd w:id="32"/>
-    <w:bookmarkStart w:id="33" w:name="plano-de-impulsionamento-parte-7"/>
+    <w:bookmarkStart w:id="33" w:name="plano-de-impulsionamento-parte-9"/>
     <w:p>
       <w:pPr>
         <w:pStyle w:val="Heading3"/>
       </w:pPr>
       <w:r>
-        <w:t xml:space="preserve">3.7 Plano de impulsionamento (Parte 7)</w:t>
+        <w:t xml:space="preserve">3.7 Plano de impulsionamento (Parte 9)</w:t>
       </w:r>
     </w:p>
     <w:p>
@@ -3745,13 +3745,13 @@
       </w:r>
     </w:p>
     <w:bookmarkEnd w:id="33"/>
-    <w:bookmarkStart w:id="34" w:name="respostas-rápidas-parte-8"/>
+    <w:bookmarkStart w:id="34" w:name="respostas-rápidas-parte-10"/>
     <w:p>
       <w:pPr>
         <w:pStyle w:val="Heading3"/>
       </w:pPr>
       <w:r>
-        <w:t xml:space="preserve">3.8 Respostas rápidas (Parte 8)</w:t>
+        <w:t xml:space="preserve">3.8 Respostas rápidas (Parte 10)</w:t>
       </w:r>
     </w:p>
     <w:p>
@@ -3931,13 +3931,13 @@
       </w:r>
     </w:p>
     <w:bookmarkEnd w:id="34"/>
-    <w:bookmarkStart w:id="35" w:name="X480498e9b992c23d7c9b6e81df0279bf7afe94f"/>
+    <w:bookmarkStart w:id="35" w:name="X0b69328ebc26ca9b459d2e336a44948fae799be"/>
     <w:p>
       <w:pPr>
         <w:pStyle w:val="Heading3"/>
       </w:pPr>
       <w:r>
-        <w:t xml:space="preserve">3.9 Plano de tratamento compreensível (Parte 10)</w:t>
+        <w:t xml:space="preserve">3.9 Plano de tratamento compreensível (Parte 12)</w:t>
       </w:r>
     </w:p>
     <w:p>
@@ -4144,13 +4144,13 @@
       </w:r>
     </w:p>
     <w:bookmarkEnd w:id="35"/>
-    <w:bookmarkStart w:id="36" w:name="da-conversa-ao-registro-parte-11"/>
+    <w:bookmarkStart w:id="36" w:name="da-conversa-ao-registro-parte-13"/>
     <w:p>
       <w:pPr>
         <w:pStyle w:val="Heading3"/>
       </w:pPr>
       <w:r>
-        <w:t xml:space="preserve">3.10 Da conversa ao registro (Parte 11)</w:t>
+        <w:t xml:space="preserve">3.10 Da conversa ao registro (Parte 13)</w:t>
       </w:r>
     </w:p>
     <w:p>
@@ -4399,13 +4399,13 @@
       </w:r>
     </w:p>
     <w:bookmarkEnd w:id="36"/>
-    <w:bookmarkStart w:id="37" w:name="gerador-de-campanha-completa-parte-13"/>
+    <w:bookmarkStart w:id="37" w:name="gerador-de-campanha-completa-parte-15"/>
     <w:p>
       <w:pPr>
         <w:pStyle w:val="Heading3"/>
       </w:pPr>
       <w:r>
-        <w:t xml:space="preserve">3.11 Gerador de campanha completa (Parte 13)</w:t>
+        <w:t xml:space="preserve">3.11 Gerador de campanha completa (Parte 15)</w:t>
       </w:r>
     </w:p>
     <w:p>
@@ -4564,13 +4564,13 @@
       </w:r>
     </w:p>
     <w:bookmarkEnd w:id="37"/>
-    <w:bookmarkStart w:id="38" w:name="verificador-ético-parte-13"/>
+    <w:bookmarkStart w:id="38" w:name="verificador-ético-parte-15"/>
     <w:p>
       <w:pPr>
         <w:pStyle w:val="Heading3"/>
       </w:pPr>
       <w:r>
-        <w:t xml:space="preserve">3.12 Verificador ético (Parte 13)</w:t>
+        <w:t xml:space="preserve">3.12 Verificador ético (Parte 15)</w:t>
       </w:r>
     </w:p>
     <w:p>
@@ -5244,7 +5244,7 @@
               <w:jc w:val="left"/>
             </w:pPr>
             <w:r>
-              <w:t xml:space="preserve">O guia não automatiza nem integra WhatsApp. Em troca, é gratuito, ensina o método e traz as regras do conselho. Quando o volume crescer, o profissional deve migrar para um CRM e levar o método</w:t>
+              <w:t xml:space="preserve">O guia não automatiza nem integra WhatsApp. Em troca, não cobra mensalidade, ensina o método e traz as regras do conselho. Quando o volume crescer, o profissional deve migrar para um CRM e levar o método</w:t>
             </w:r>
           </w:p>
         </w:tc>
@@ -5376,7 +5376,7 @@
         <w:pStyle w:val="Compact"/>
       </w:pPr>
       <w:r>
-        <w:t xml:space="preserve">Une método, prompts e ferramenta de registro num único conjunto, gratuito e sem cadastro.</w:t>
+        <w:t xml:space="preserve">Une método, prompts e ferramenta de registro num único conjunto, sem mensalidade.</w:t>
       </w:r>
     </w:p>
     <w:p>

</xml_diff>